<commit_message>
chore(agent): harden cross-runtime harness
</commit_message>
<xml_diff>
--- a/docs/generated/ai-native-handbook.docx
+++ b/docs/generated/ai-native-handbook.docx
@@ -243,7 +243,7 @@
         <w:pStyle w:val="ListNumber"/>
       </w:pPr>
       <w:r>
-        <w:t xml:space="preserve">3. Harness engineering bao agent bằng router, skill, guard, hook, CI và execution budget.</w:t>
+        <w:t xml:space="preserve">3. Harness engineering bao agent bằng router, skill, runtime adapter, guard, hook, CI và execution budget.</w:t>
       </w:r>
     </w:p>
     <w:p>
@@ -639,15 +639,15 @@
         <w:pStyle w:val="TableCell"/>
       </w:pPr>
       <w:r>
-        <w:t xml:space="preserve">Litmatch đang làm gì: .agents/context-map.json, pnpm agent:context, Read first/Read when applicable, canonical-source hierarchy, bounded file/log reads và handoff gọn tạo progressive disclosure.</w:t>
-      </w:r>
-    </w:p>
-    <w:p>
-      <w:pPr>
-        <w:pStyle w:val="TableCell"/>
-      </w:pPr>
-      <w:r>
-        <w:t xml:space="preserve">Vì sao chưa làm thêm / trigger xem xét lại: Không nạp toàn repo hoặc mọi checklist theo thói quen vì attention/context là hữu hạn. Mở rộng scope khi một task lặp lại đang thiếu đúng nguồn bắt buộc.</w:t>
+        <w:t xml:space="preserve">Litmatch đang làm gì: Startup chỉ giữ stable map; .agents/context-map.json, Read first/Read when applicable, bounded file/log reads và handoff gọn tạo progressive disclosure theo scope.</w:t>
+      </w:r>
+    </w:p>
+    <w:p>
+      <w:pPr>
+        <w:pStyle w:val="TableCell"/>
+      </w:pPr>
+      <w:r>
+        <w:t xml:space="preserve">Vì sao chưa làm thêm / trigger xem xét lại: Không inject roadmap/backlog hoặc nạp toàn repo theo thói quen vì attention/context là hữu hạn. Mở rộng scope khi một task lặp lại đang thiếu đúng nguồn bắt buộc.</w:t>
       </w:r>
     </w:p>
     <w:p>
@@ -671,7 +671,7 @@
         <w:pStyle w:val="TableCell"/>
       </w:pPr>
       <w:r>
-        <w:t xml:space="preserve">Litmatch đang làm gì: AGENTS.md, skills, router, pre-tool guard, repository checker, hooks, CI và execution budget bao quanh runtime/model.</w:t>
+        <w:t xml:space="preserve">Litmatch đang làm gì: AGENTS.md, skills, router, adapter parity, startup context gọn, pre-tool guard, repository checker, hooks, CI và execution budget bao quanh runtime/model.</w:t>
       </w:r>
     </w:p>
     <w:p>
@@ -687,6 +687,38 @@
         <w:pStyle w:val="TableCardTitle"/>
       </w:pPr>
       <w:r>
+        <w:t xml:space="preserve">Runtime portability</w:t>
+      </w:r>
+    </w:p>
+    <w:p>
+      <w:pPr>
+        <w:pStyle w:val="TableCell"/>
+      </w:pPr>
+      <w:r>
+        <w:t xml:space="preserve">Trạng thái: Applied cho contract/skills bắt buộc</w:t>
+      </w:r>
+    </w:p>
+    <w:p>
+      <w:pPr>
+        <w:pStyle w:val="TableCell"/>
+      </w:pPr>
+      <w:r>
+        <w:t xml:space="preserve">Litmatch đang làm gì: Contract/skill bắt buộc có adapter symlink về canonical; checker đối chiếu exact target trên working tree và Git index, bắt thiếu, gãy hoặc trỏ nhầm scope.</w:t>
+      </w:r>
+    </w:p>
+    <w:p>
+      <w:pPr>
+        <w:pStyle w:val="TableCell"/>
+      </w:pPr>
+      <w:r>
+        <w:t xml:space="preserve">Vì sao chưa làm thêm / trigger xem xét lại: Symlink giữ một nguồn sự thật nhưng cần môi trường hỗ trợ symlink. Adapter có behavior riêng vẫn ở thư mục runtime và phải tái dùng guard/core contract chung.</w:t>
+      </w:r>
+    </w:p>
+    <w:p>
+      <w:pPr>
+        <w:pStyle w:val="TableCardTitle"/>
+      </w:pPr>
+      <w:r>
         <w:t xml:space="preserve">Policy/guardrails as code</w:t>
       </w:r>
     </w:p>
@@ -735,15 +767,15 @@
         <w:pStyle w:val="TableCell"/>
       </w:pPr>
       <w:r>
-        <w:t xml:space="preserve">Litmatch đang làm gì: adaptive-orchestration giữ root làm owner, chỉ fan-out workstream độc lập, cap hai sub-agent và nâng tier theo risk/conflict.</w:t>
-      </w:r>
-    </w:p>
-    <w:p>
-      <w:pPr>
-        <w:pStyle w:val="TableCell"/>
-      </w:pPr>
-      <w:r>
-        <w:t xml:space="preserve">Vì sao chưa làm thêm / trigger xem xét lại: Không dùng “swarm” mặc định vì tăng token, collision và khó quy trách nhiệm. Tăng fan-out chỉ sau khi contract repo đổi kèm eval chất lượng/chi phí.</w:t>
+        <w:t xml:space="preserve">Litmatch đang làm gì: adaptive-orchestration giữ root làm owner, chỉ fan-out workstream độc lập, cap hai sub-agent, chia file ownership và ưu tiên worktree cho writer song song.</w:t>
+      </w:r>
+    </w:p>
+    <w:p>
+      <w:pPr>
+        <w:pStyle w:val="TableCell"/>
+      </w:pPr>
+      <w:r>
+        <w:t xml:space="preserve">Vì sao chưa làm thêm / trigger xem xét lại: Không dùng “swarm” mặc định vì tăng token, collision và khó quy trách nhiệm. Worktree thêm setup/disk/cache; shared worktree chỉ dùng khi path disjoint và stage tường minh.</w:t>
       </w:r>
     </w:p>
     <w:p>
@@ -1116,7 +1148,7 @@
         <w:pStyle w:val="ListBullet"/>
       </w:pPr>
       <w:r>
-        <w:t xml:space="preserve">• Guard/harness: pre-tool-guard.mjs (../scripts/agent/pre-tool-guard.mjs), guard-core.mjs (../scripts/agent/guard-core.mjs), repository-check.mjs (../scripts/agent/repository-check.mjs) và rule enforcement matrix (./14-rule-enforcement-matrix.md).</w:t>
+        <w:t xml:space="preserve">• Guard/harness: adapter-parity.mjs (../scripts/agent/adapter-parity.mjs), pre-tool-guard.mjs (../scripts/agent/pre-tool-guard.mjs), guard-core.mjs (../scripts/agent/guard-core.mjs), repository-check.mjs (../scripts/agent/repository-check.mjs) và rule enforcement matrix (./14-rule-enforcement-matrix.md).</w:t>
       </w:r>
     </w:p>
     <w:p>
@@ -1555,7 +1587,7 @@
         <w:pStyle w:val="ListBullet"/>
       </w:pPr>
       <w:r>
-        <w:t xml:space="preserve">• OpenAI: Harness engineering (https://openai.com/index/harness-engineering/) và Model optimization (https://developers.openai.com/api/docs/guides/model-optimization).</w:t>
+        <w:t xml:space="preserve">• OpenAI: Harness engineering (https://openai.com/index/harness-engineering/) và A practical guide to building agents (https://openai.com/business/guides-and-resources/a-practical-guide-to-building-ai-agents/).</w:t>
       </w:r>
     </w:p>
     <w:p>
@@ -1584,7 +1616,7 @@
     </w:p>
     <w:p>
       <w:r>
-        <w:t xml:space="preserve">Kiểm lại nguồn ngày 2026-07-28. Khi trend hoặc API đổi, cập nhật phần giải thích/trigger; không đổi status “Applied” nếu chưa có source + executable evidence tương ứng trong repository.</w:t>
+        <w:t xml:space="preserve">Kiểm lại nguồn ngày 2026-07-30. Khi trend hoặc API đổi, cập nhật phần giải thích/trigger; không đổi status “Applied” nếu chưa có source + executable evidence tương ứng trong repository.</w:t>
       </w:r>
     </w:p>
     <w:sectPr>

</xml_diff>

<commit_message>
fix(ci): unify local and hosted release gates (#50)
## Summary
- make local hooks, GitHub Actions, and hosted release use one
fail-closed CI contract
- remove CI/hosted bypass paths and require an exact successful `ci.yml`
push run on `main` before release
- make quality gates check-only, deterministic (`NX_TUI=false`, static
output, frozen lockfile), and isolate Nx state per local-CI process
- harden workflow policy and staged-index validation, including
regression tests for bypasses, release provenance, and process cleanup

## Verification
- `pnpm ci:local:test` — PASS (32 tests)
- `pnpm agent:verify infra` — PASS
- `pnpm ci:preflight` — PASS twice after final cache isolation,
including clean Node 22, lint, unit/integration tests, builds, E2E,
migrations, Docker images, and runtime smoke
- pre-push `pnpm ci:preflight` — PASS, no bypass

`review-module: N/A` — CI/tooling/docs only; no business flow changed.
</commit_message>
<xml_diff>
--- a/docs/generated/ai-native-handbook.docx
+++ b/docs/generated/ai-native-handbook.docx
@@ -243,7 +243,7 @@
         <w:pStyle w:val="ListNumber"/>
       </w:pPr>
       <w:r>
-        <w:t xml:space="preserve">3. Harness engineering bao agent bằng router, skill, guard, hook, CI và execution budget.</w:t>
+        <w:t xml:space="preserve">3. Harness engineering bao agent bằng router, skill, runtime adapter, guard, hook, CI và execution budget.</w:t>
       </w:r>
     </w:p>
     <w:p>
@@ -639,15 +639,15 @@
         <w:pStyle w:val="TableCell"/>
       </w:pPr>
       <w:r>
-        <w:t xml:space="preserve">Litmatch đang làm gì: .agents/context-map.json, pnpm agent:context, Read first/Read when applicable, canonical-source hierarchy, bounded file/log reads và handoff gọn tạo progressive disclosure.</w:t>
-      </w:r>
-    </w:p>
-    <w:p>
-      <w:pPr>
-        <w:pStyle w:val="TableCell"/>
-      </w:pPr>
-      <w:r>
-        <w:t xml:space="preserve">Vì sao chưa làm thêm / trigger xem xét lại: Không nạp toàn repo hoặc mọi checklist theo thói quen vì attention/context là hữu hạn. Mở rộng scope khi một task lặp lại đang thiếu đúng nguồn bắt buộc.</w:t>
+        <w:t xml:space="preserve">Litmatch đang làm gì: Startup chỉ giữ stable map; .agents/context-map.json, Read first/Read when applicable, bounded file/log reads và handoff gọn tạo progressive disclosure theo scope.</w:t>
+      </w:r>
+    </w:p>
+    <w:p>
+      <w:pPr>
+        <w:pStyle w:val="TableCell"/>
+      </w:pPr>
+      <w:r>
+        <w:t xml:space="preserve">Vì sao chưa làm thêm / trigger xem xét lại: Không inject roadmap/backlog hoặc nạp toàn repo theo thói quen vì attention/context là hữu hạn. Mở rộng scope khi một task lặp lại đang thiếu đúng nguồn bắt buộc.</w:t>
       </w:r>
     </w:p>
     <w:p>
@@ -671,7 +671,7 @@
         <w:pStyle w:val="TableCell"/>
       </w:pPr>
       <w:r>
-        <w:t xml:space="preserve">Litmatch đang làm gì: AGENTS.md, skills, router, pre-tool guard, repository checker, hooks, CI và execution budget bao quanh runtime/model.</w:t>
+        <w:t xml:space="preserve">Litmatch đang làm gì: AGENTS.md, skills, router, adapter parity, startup context gọn, pre-tool guard, repository checker, hooks, CI và execution budget bao quanh runtime/model.</w:t>
       </w:r>
     </w:p>
     <w:p>
@@ -687,6 +687,38 @@
         <w:pStyle w:val="TableCardTitle"/>
       </w:pPr>
       <w:r>
+        <w:t xml:space="preserve">Runtime portability</w:t>
+      </w:r>
+    </w:p>
+    <w:p>
+      <w:pPr>
+        <w:pStyle w:val="TableCell"/>
+      </w:pPr>
+      <w:r>
+        <w:t xml:space="preserve">Trạng thái: Applied cho contract/skills bắt buộc</w:t>
+      </w:r>
+    </w:p>
+    <w:p>
+      <w:pPr>
+        <w:pStyle w:val="TableCell"/>
+      </w:pPr>
+      <w:r>
+        <w:t xml:space="preserve">Litmatch đang làm gì: Contract/skill bắt buộc có adapter symlink về canonical; checker đối chiếu exact target trên working tree và Git index, bắt thiếu, gãy hoặc trỏ nhầm scope.</w:t>
+      </w:r>
+    </w:p>
+    <w:p>
+      <w:pPr>
+        <w:pStyle w:val="TableCell"/>
+      </w:pPr>
+      <w:r>
+        <w:t xml:space="preserve">Vì sao chưa làm thêm / trigger xem xét lại: Symlink giữ một nguồn sự thật nhưng cần môi trường hỗ trợ symlink. Adapter có behavior riêng vẫn ở thư mục runtime và phải tái dùng guard/core contract chung.</w:t>
+      </w:r>
+    </w:p>
+    <w:p>
+      <w:pPr>
+        <w:pStyle w:val="TableCardTitle"/>
+      </w:pPr>
+      <w:r>
         <w:t xml:space="preserve">Policy/guardrails as code</w:t>
       </w:r>
     </w:p>
@@ -735,15 +767,15 @@
         <w:pStyle w:val="TableCell"/>
       </w:pPr>
       <w:r>
-        <w:t xml:space="preserve">Litmatch đang làm gì: adaptive-orchestration giữ root làm owner, chỉ fan-out workstream độc lập, cap hai sub-agent và nâng tier theo risk/conflict.</w:t>
-      </w:r>
-    </w:p>
-    <w:p>
-      <w:pPr>
-        <w:pStyle w:val="TableCell"/>
-      </w:pPr>
-      <w:r>
-        <w:t xml:space="preserve">Vì sao chưa làm thêm / trigger xem xét lại: Không dùng “swarm” mặc định vì tăng token, collision và khó quy trách nhiệm. Tăng fan-out chỉ sau khi contract repo đổi kèm eval chất lượng/chi phí.</w:t>
+        <w:t xml:space="preserve">Litmatch đang làm gì: adaptive-orchestration giữ root làm owner, chỉ fan-out workstream độc lập, cap hai sub-agent, chia file ownership và ưu tiên worktree cho writer song song.</w:t>
+      </w:r>
+    </w:p>
+    <w:p>
+      <w:pPr>
+        <w:pStyle w:val="TableCell"/>
+      </w:pPr>
+      <w:r>
+        <w:t xml:space="preserve">Vì sao chưa làm thêm / trigger xem xét lại: Không dùng “swarm” mặc định vì tăng token, collision và khó quy trách nhiệm. Worktree thêm setup/disk/cache; shared worktree chỉ dùng khi path disjoint và stage tường minh.</w:t>
       </w:r>
     </w:p>
     <w:p>
@@ -1116,7 +1148,7 @@
         <w:pStyle w:val="ListBullet"/>
       </w:pPr>
       <w:r>
-        <w:t xml:space="preserve">• Guard/harness: pre-tool-guard.mjs (../scripts/agent/pre-tool-guard.mjs), guard-core.mjs (../scripts/agent/guard-core.mjs), repository-check.mjs (../scripts/agent/repository-check.mjs) và rule enforcement matrix (./14-rule-enforcement-matrix.md).</w:t>
+        <w:t xml:space="preserve">• Guard/harness: adapter-parity.mjs (../scripts/agent/adapter-parity.mjs), pre-tool-guard.mjs (../scripts/agent/pre-tool-guard.mjs), guard-core.mjs (../scripts/agent/guard-core.mjs), repository-check.mjs (../scripts/agent/repository-check.mjs) và rule enforcement matrix (./14-rule-enforcement-matrix.md).</w:t>
       </w:r>
     </w:p>
     <w:p>
@@ -1555,7 +1587,7 @@
         <w:pStyle w:val="ListBullet"/>
       </w:pPr>
       <w:r>
-        <w:t xml:space="preserve">• OpenAI: Harness engineering (https://openai.com/index/harness-engineering/) và Model optimization (https://developers.openai.com/api/docs/guides/model-optimization).</w:t>
+        <w:t xml:space="preserve">• OpenAI: Harness engineering (https://openai.com/index/harness-engineering/) và A practical guide to building agents (https://openai.com/business/guides-and-resources/a-practical-guide-to-building-ai-agents/).</w:t>
       </w:r>
     </w:p>
     <w:p>
@@ -1584,7 +1616,7 @@
     </w:p>
     <w:p>
       <w:r>
-        <w:t xml:space="preserve">Kiểm lại nguồn ngày 2026-07-28. Khi trend hoặc API đổi, cập nhật phần giải thích/trigger; không đổi status “Applied” nếu chưa có source + executable evidence tương ứng trong repository.</w:t>
+        <w:t xml:space="preserve">Kiểm lại nguồn ngày 2026-07-30. Khi trend hoặc API đổi, cập nhật phần giải thích/trigger; không đổi status “Applied” nếu chưa có source + executable evidence tương ứng trong repository.</w:t>
       </w:r>
     </w:p>
     <w:sectPr>

</xml_diff>

<commit_message>
refactor(ai): review codebase and optimize AI token efficiency
- Add phase-based optimization criteria
- Review and refine AI-native token optimization guidelines
- Evaluate and apply code quality improvements
</commit_message>
<xml_diff>
--- a/docs/generated/ai-native-handbook.docx
+++ b/docs/generated/ai-native-handbook.docx
@@ -759,23 +759,23 @@
         <w:pStyle w:val="TableCell"/>
       </w:pPr>
       <w:r>
-        <w:t xml:space="preserve">Trạng thái: Applied, bounded</w:t>
-      </w:r>
-    </w:p>
-    <w:p>
-      <w:pPr>
-        <w:pStyle w:val="TableCell"/>
-      </w:pPr>
-      <w:r>
-        <w:t xml:space="preserve">Litmatch đang làm gì: adaptive-orchestration giữ root làm owner, chỉ fan-out workstream độc lập, cap hai sub-agent, chia file ownership và ưu tiên worktree cho writer song song.</w:t>
-      </w:r>
-    </w:p>
-    <w:p>
-      <w:pPr>
-        <w:pStyle w:val="TableCell"/>
-      </w:pPr>
-      <w:r>
-        <w:t xml:space="preserve">Vì sao chưa làm thêm / trigger xem xét lại: Không dùng “swarm” mặc định vì tăng token, collision và khó quy trách nhiệm. Worktree thêm setup/disk/cache; shared worktree chỉ dùng khi path disjoint và stage tường minh.</w:t>
+        <w:t xml:space="preserve">Trạng thái: Partial, bounded policy</w:t>
+      </w:r>
+    </w:p>
+    <w:p>
+      <w:pPr>
+        <w:pStyle w:val="TableCell"/>
+      </w:pPr>
+      <w:r>
+        <w:t xml:space="preserve">Litmatch đang làm gì: route-task.mjs có router deterministic, giữ root làm owner, giới hạn fan-out và có test; việc runtime thực sự tạo delegate/chọn model vẫn phụ thuộc runtime adapter.</w:t>
+      </w:r>
+    </w:p>
+    <w:p>
+      <w:pPr>
+        <w:pStyle w:val="TableCell"/>
+      </w:pPr>
+      <w:r>
+        <w:t xml:space="preserve">Vì sao chưa làm thêm / trigger xem xét lại: Không claim model đã được đổi nếu runtime không expose override. Chỉ tích hợp execution binding khi có runtime ổn định và chứng minh giảm cost/không giảm quality.</w:t>
       </w:r>
     </w:p>
     <w:p>
@@ -1546,6 +1546,14 @@
       </w:pPr>
       <w:r>
         <w:t xml:space="preserve">• Giữ ngay bây giờ: context theo scope, harness nhỏ kiểm tra được, guard độc lập model, eval hai tầng, root authority và sub-agent cap.</w:t>
+      </w:r>
+    </w:p>
+    <w:p>
+      <w:pPr>
+        <w:pStyle w:val="ListBullet"/>
+      </w:pPr>
+      <w:r>
+        <w:t xml:space="preserve">• Routing policy deterministic được giữ như một cơ chế bounded; không xem output route là bằng chứng runtime đã tạo delegate hoặc đổi model.</w:t>
       </w:r>
     </w:p>
     <w:p>

</xml_diff>